<commit_message>
Remove duplicate class line; replace انشر with وسّع
Co-Authored-By: Claude Opus 5.5 <noreply@anthropic.com>
Claude-Session: https://claude.ai/code/session_013qbpWHwo1Afqj3dzgsH1oY
</commit_message>
<xml_diff>
--- a/BT2-امتحان-رياضيات.docx
+++ b/BT2-امتحان-رياضيات.docx
@@ -131,35 +131,6 @@
               <w:t xml:space="preserve">امتحان مادة الرياضيات</w:t>
             </w:r>
           </w:p>
-          <w:p>
-            <w:pPr>
-              <w:bidi/>
-              <w:spacing w:before="0" w:after="0" w:line="276" w:lineRule="auto"/>
-              <w:jc w:val="center"/>
-            </w:pPr>
-            <w:r>
-              <w:rPr>
-                <w:rFonts w:ascii="Calibri" w:eastAsia="Calibri" w:hAnsi="Calibri" w:cs="Arial"/>
-                <w:b/>
-                <w:bCs/>
-                <w:color w:val="6B6B6B"/>
-                <w:sz w:val="28"/>
-                <w:szCs w:val="28"/>
-                <w:rtl/>
-              </w:rPr>
-              <w:t xml:space="preserve">الصف </w:t>
-            </w:r>
-            <w:r>
-              <w:rPr>
-                <w:rFonts w:ascii="Cambria Math" w:hAnsi="Cambria Math" w:cs="Cambria Math"/>
-                <w:b/>
-                <w:color w:val="B8860B"/>
-                <w:sz w:val="28"/>
-                <w:szCs w:val="28"/>
-              </w:rPr>
-              <w:t xml:space="preserve">BT2</w:t>
-            </w:r>
-          </w:p>
         </w:tc>
       </w:tr>
     </w:tbl>
@@ -834,7 +805,7 @@
           <w:szCs w:val="36"/>
           <w:rtl/>
         </w:rPr>
-        <w:t xml:space="preserve">انشر وبسّط:  </w:t>
+        <w:t xml:space="preserve">وسّع وبسّط:  </w:t>
       </w:r>
       <m:oMath>
         <m:sSup>

</xml_diff>

<commit_message>
Remove exam title banner
Co-Authored-By: Claude Opus 5.5 <noreply@anthropic.com>
Claude-Session: https://claude.ai/code/session_013qbpWHwo1Afqj3dzgsH1oY
</commit_message>
<xml_diff>
--- a/BT2-امتحان-رياضيات.docx
+++ b/BT2-امتحان-رياضيات.docx
@@ -67,78 +67,6 @@
           </wp:inline>
         </w:drawing>
       </w:r>
-    </w:p>
-    <w:tbl>
-      <w:tblPr>
-        <w:bidiVisual/>
-        <w:tblW w:w="10440" w:type="dxa"/>
-        <w:jc w:val="center"/>
-        <w:tblBorders>
-          <w:top w:val="nil" w:sz="4" w:space="0" w:color="BFBFBF"/>
-          <w:left w:val="nil" w:sz="4" w:space="0" w:color="BFBFBF"/>
-          <w:bottom w:val="nil" w:sz="4" w:space="0" w:color="BFBFBF"/>
-          <w:right w:val="nil" w:sz="4" w:space="0" w:color="BFBFBF"/>
-          <w:insideH w:val="nil" w:sz="4" w:space="0" w:color="BFBFBF"/>
-          <w:insideV w:val="nil" w:sz="4" w:space="0" w:color="BFBFBF"/>
-        </w:tblBorders>
-        <w:tblLayout w:type="fixed"/>
-        <w:tblCellMar>
-          <w:top w:w="80" w:type="dxa"/>
-          <w:left w:w="110" w:type="dxa"/>
-          <w:bottom w:w="80" w:type="dxa"/>
-          <w:right w:w="110" w:type="dxa"/>
-        </w:tblCellMar>
-        <w:tblLook w:val="04A0" w:firstRow="1" w:lastRow="0" w:firstColumn="1" w:lastColumn="0" w:noHBand="0" w:noVBand="1"/>
-      </w:tblPr>
-      <w:tblGrid>
-        <w:gridCol w:w="10440"/>
-      </w:tblGrid>
-      <w:tr>
-        <w:trPr>
-          <w:cantSplit/>
-        </w:trPr>
-        <w:tc>
-          <w:tcPr>
-            <w:tcW w:w="10440" w:type="dxa"/>
-            <w:tcBorders>
-              <w:top w:val="single" w:sz="8" w:space="0" w:color="B8860B"/>
-              <w:left w:val="nil" w:sz="4" w:space="0" w:color="BFBFBF"/>
-              <w:bottom w:val="single" w:sz="8" w:space="0" w:color="B8860B"/>
-              <w:right w:val="nil" w:sz="4" w:space="0" w:color="BFBFBF"/>
-            </w:tcBorders>
-            <w:tcMar>
-              <w:top w:w="80" w:type="dxa"/>
-              <w:bottom w:w="80" w:type="dxa"/>
-            </w:tcMar>
-            <w:vAlign w:val="center"/>
-          </w:tcPr>
-          <w:p>
-            <w:pPr>
-              <w:bidi/>
-              <w:spacing w:before="0" w:after="0" w:line="276" w:lineRule="auto"/>
-              <w:jc w:val="center"/>
-            </w:pPr>
-            <w:r>
-              <w:rPr>
-                <w:rFonts w:ascii="Calibri" w:eastAsia="Calibri" w:hAnsi="Calibri" w:cs="Arial"/>
-                <w:b/>
-                <w:bCs/>
-                <w:color w:val="14532D"/>
-                <w:sz w:val="40"/>
-                <w:szCs w:val="40"/>
-                <w:rtl/>
-              </w:rPr>
-              <w:t xml:space="preserve">امتحان مادة الرياضيات</w:t>
-            </w:r>
-          </w:p>
-        </w:tc>
-      </w:tr>
-    </w:tbl>
-    <w:p>
-      <w:pPr>
-        <w:bidi/>
-        <w:spacing w:before="0" w:after="0" w:line="120" w:lineRule="exact"/>
-      </w:pPr>
     </w:p>
     <w:tbl>
       <w:tblPr>

</xml_diff>

<commit_message>
Tighten spacing so question 4 fits at the bottom of page 1
Co-Authored-By: Claude Opus 5.5 <noreply@anthropic.com>
Claude-Session: https://claude.ai/code/session_013qbpWHwo1Afqj3dzgsH1oY
</commit_message>
<xml_diff>
--- a/BT2-امتحان-رياضيات.docx
+++ b/BT2-امتحان-رياضيات.docx
@@ -5,7 +5,7 @@
   <w:body>
     <w:p>
       <w:pPr>
-        <w:spacing w:after="180"/>
+        <w:spacing w:after="40"/>
         <w:jc w:val="right"/>
         <w:rPr>
           <w:rFonts w:ascii="Calibri" w:eastAsia="Calibri" w:hAnsi="Calibri" w:cs="Calibri"/>
@@ -349,7 +349,7 @@
         </w:pBdr>
         <w:shd w:val="clear" w:color="auto" w:fill="DDF3E4"/>
         <w:bidi/>
-        <w:spacing w:before="200" w:after="0" w:line="276" w:lineRule="auto"/>
+        <w:spacing w:before="80" w:after="0" w:line="276" w:lineRule="auto"/>
         <w:ind w:left="120" w:right="120"/>
       </w:pPr>
       <w:r>
@@ -388,7 +388,7 @@
         </w:pBdr>
         <w:shd w:val="clear" w:color="auto" w:fill="F7FBF8"/>
         <w:bidi/>
-        <w:spacing w:before="20" w:after="40" w:line="276" w:lineRule="auto"/>
+        <w:spacing w:before="0" w:after="20" w:line="252" w:lineRule="auto"/>
         <w:ind w:left="170" w:right="170"/>
       </w:pPr>
       <w:r>
@@ -412,7 +412,7 @@
         </w:pBdr>
         <w:shd w:val="clear" w:color="auto" w:fill="F7FBF8"/>
         <w:bidi/>
-        <w:spacing w:before="20" w:after="40" w:line="276" w:lineRule="auto"/>
+        <w:spacing w:before="0" w:after="20" w:line="252" w:lineRule="auto"/>
         <w:ind w:left="170" w:right="170"/>
       </w:pPr>
       <w:r>
@@ -523,7 +523,7 @@
         </w:pBdr>
         <w:shd w:val="clear" w:color="auto" w:fill="F7FBF8"/>
         <w:bidi/>
-        <w:spacing w:before="20" w:after="40" w:line="276" w:lineRule="auto"/>
+        <w:spacing w:before="0" w:after="20" w:line="252" w:lineRule="auto"/>
         <w:ind w:left="170" w:right="170"/>
       </w:pPr>
       <w:r>
@@ -671,7 +671,7 @@
         </w:pBdr>
         <w:shd w:val="clear" w:color="auto" w:fill="DDF3E4"/>
         <w:bidi/>
-        <w:spacing w:before="200" w:after="0" w:line="276" w:lineRule="auto"/>
+        <w:spacing w:before="80" w:after="0" w:line="276" w:lineRule="auto"/>
         <w:ind w:left="120" w:right="120"/>
       </w:pPr>
       <w:r>
@@ -710,7 +710,7 @@
         </w:pBdr>
         <w:shd w:val="clear" w:color="auto" w:fill="F7FBF8"/>
         <w:bidi/>
-        <w:spacing w:before="20" w:after="40" w:line="276" w:lineRule="auto"/>
+        <w:spacing w:before="0" w:after="20" w:line="252" w:lineRule="auto"/>
         <w:ind w:left="170" w:right="170"/>
       </w:pPr>
       <w:r>
@@ -816,7 +816,7 @@
         </w:pBdr>
         <w:shd w:val="clear" w:color="auto" w:fill="F7FBF8"/>
         <w:bidi/>
-        <w:spacing w:before="20" w:after="40" w:line="276" w:lineRule="auto"/>
+        <w:spacing w:before="0" w:after="20" w:line="252" w:lineRule="auto"/>
         <w:ind w:left="170" w:right="170"/>
       </w:pPr>
       <w:r>
@@ -922,7 +922,7 @@
         </w:pBdr>
         <w:shd w:val="clear" w:color="auto" w:fill="DDF3E4"/>
         <w:bidi/>
-        <w:spacing w:before="200" w:after="0" w:line="276" w:lineRule="auto"/>
+        <w:spacing w:before="80" w:after="0" w:line="276" w:lineRule="auto"/>
         <w:ind w:left="120" w:right="120"/>
       </w:pPr>
       <w:r>
@@ -961,7 +961,7 @@
         </w:pBdr>
         <w:shd w:val="clear" w:color="auto" w:fill="F7FBF8"/>
         <w:bidi/>
-        <w:spacing w:before="20" w:after="40" w:line="276" w:lineRule="auto"/>
+        <w:spacing w:before="0" w:after="20" w:line="252" w:lineRule="auto"/>
         <w:ind w:left="170" w:right="170"/>
       </w:pPr>
       <w:r>
@@ -1008,7 +1008,7 @@
         </w:pBdr>
         <w:shd w:val="clear" w:color="auto" w:fill="F7FBF8"/>
         <w:bidi/>
-        <w:spacing w:before="20" w:after="40" w:line="276" w:lineRule="auto"/>
+        <w:spacing w:before="0" w:after="20" w:line="252" w:lineRule="auto"/>
         <w:ind w:left="170" w:right="170"/>
       </w:pPr>
       <w:r>
@@ -1150,7 +1150,7 @@
         </w:pBdr>
         <w:shd w:val="clear" w:color="auto" w:fill="F7FBF8"/>
         <w:bidi/>
-        <w:spacing w:before="20" w:after="40" w:line="276" w:lineRule="auto"/>
+        <w:spacing w:before="0" w:after="20" w:line="252" w:lineRule="auto"/>
         <w:ind w:left="170" w:right="170"/>
       </w:pPr>
       <w:r>
@@ -1292,7 +1292,7 @@
         </w:pBdr>
         <w:shd w:val="clear" w:color="auto" w:fill="DDF3E4"/>
         <w:bidi/>
-        <w:spacing w:before="200" w:after="0" w:line="276" w:lineRule="auto"/>
+        <w:spacing w:before="80" w:after="0" w:line="276" w:lineRule="auto"/>
         <w:ind w:left="120" w:right="120"/>
       </w:pPr>
       <w:r>
@@ -1331,7 +1331,7 @@
         </w:pBdr>
         <w:shd w:val="clear" w:color="auto" w:fill="F7FBF8"/>
         <w:bidi/>
-        <w:spacing w:before="20" w:after="40" w:line="276" w:lineRule="auto"/>
+        <w:spacing w:before="0" w:after="20" w:line="252" w:lineRule="auto"/>
         <w:ind w:left="170" w:right="170"/>
       </w:pPr>
       <w:r>
@@ -1379,7 +1379,7 @@
         </w:pBdr>
         <w:shd w:val="clear" w:color="auto" w:fill="F7FBF8"/>
         <w:bidi/>
-        <w:spacing w:before="20" w:after="40" w:line="276" w:lineRule="auto"/>
+        <w:spacing w:before="0" w:after="20" w:line="252" w:lineRule="auto"/>
         <w:ind w:left="170" w:right="170"/>
         <w:jc w:val="center"/>
       </w:pPr>
@@ -1472,7 +1472,7 @@
         </w:pBdr>
         <w:shd w:val="clear" w:color="auto" w:fill="F7FBF8"/>
         <w:bidi/>
-        <w:spacing w:before="20" w:after="40" w:line="276" w:lineRule="auto"/>
+        <w:spacing w:before="0" w:after="20" w:line="252" w:lineRule="auto"/>
         <w:ind w:left="170" w:right="170"/>
       </w:pPr>
       <w:r>
@@ -1498,7 +1498,7 @@
         </w:pBdr>
         <w:shd w:val="clear" w:color="auto" w:fill="DDF3E4"/>
         <w:bidi/>
-        <w:spacing w:before="200" w:after="0" w:line="276" w:lineRule="auto"/>
+        <w:spacing w:before="80" w:after="0" w:line="276" w:lineRule="auto"/>
         <w:ind w:left="120" w:right="120"/>
       </w:pPr>
       <w:r>
@@ -1537,7 +1537,7 @@
         </w:pBdr>
         <w:shd w:val="clear" w:color="auto" w:fill="F7FBF8"/>
         <w:bidi/>
-        <w:spacing w:before="20" w:after="40" w:line="276" w:lineRule="auto"/>
+        <w:spacing w:before="0" w:after="20" w:line="252" w:lineRule="auto"/>
         <w:ind w:left="170" w:right="170"/>
       </w:pPr>
       <w:r>
@@ -1582,7 +1582,7 @@
         </w:pBdr>
         <w:shd w:val="clear" w:color="auto" w:fill="F7FBF8"/>
         <w:bidi/>
-        <w:spacing w:before="20" w:after="40" w:line="276" w:lineRule="auto"/>
+        <w:spacing w:before="0" w:after="20" w:line="252" w:lineRule="auto"/>
         <w:ind w:left="170" w:right="170"/>
       </w:pPr>
       <w:r>
@@ -1658,7 +1658,7 @@
         </w:pBdr>
         <w:shd w:val="clear" w:color="auto" w:fill="F7FBF8"/>
         <w:bidi/>
-        <w:spacing w:before="20" w:after="40" w:line="276" w:lineRule="auto"/>
+        <w:spacing w:before="0" w:after="20" w:line="252" w:lineRule="auto"/>
         <w:ind w:left="170" w:right="170"/>
       </w:pPr>
       <w:r>
@@ -1682,7 +1682,7 @@
         </w:pBdr>
         <w:shd w:val="clear" w:color="auto" w:fill="F7FBF8"/>
         <w:bidi/>
-        <w:spacing w:before="20" w:after="40" w:line="276" w:lineRule="auto"/>
+        <w:spacing w:before="0" w:after="20" w:line="252" w:lineRule="auto"/>
         <w:ind w:left="170" w:right="170"/>
       </w:pPr>
       <w:r>
@@ -1749,7 +1749,7 @@
         </w:pBdr>
         <w:shd w:val="clear" w:color="auto" w:fill="F7FBF8"/>
         <w:bidi/>
-        <w:spacing w:before="20" w:after="40" w:line="276" w:lineRule="auto"/>
+        <w:spacing w:before="0" w:after="20" w:line="252" w:lineRule="auto"/>
         <w:ind w:left="170" w:right="170"/>
       </w:pPr>
       <w:r>
@@ -1816,7 +1816,7 @@
         </w:pBdr>
         <w:shd w:val="clear" w:color="auto" w:fill="F7FBF8"/>
         <w:bidi/>
-        <w:spacing w:before="20" w:after="40" w:line="276" w:lineRule="auto"/>
+        <w:spacing w:before="0" w:after="20" w:line="252" w:lineRule="auto"/>
         <w:ind w:left="170" w:right="170"/>
       </w:pPr>
       <w:r>
@@ -1878,7 +1878,7 @@
         </w:pBdr>
         <w:shd w:val="clear" w:color="auto" w:fill="F7FBF8"/>
         <w:bidi/>
-        <w:spacing w:before="20" w:after="40" w:line="276" w:lineRule="auto"/>
+        <w:spacing w:before="0" w:after="20" w:line="252" w:lineRule="auto"/>
         <w:ind w:left="170" w:right="170"/>
       </w:pPr>
       <w:r>
@@ -1973,7 +1973,7 @@
         </w:pBdr>
         <w:shd w:val="clear" w:color="auto" w:fill="DDF3E4"/>
         <w:bidi/>
-        <w:spacing w:before="200" w:after="0" w:line="276" w:lineRule="auto"/>
+        <w:spacing w:before="80" w:after="0" w:line="276" w:lineRule="auto"/>
         <w:ind w:left="120" w:right="120"/>
       </w:pPr>
       <w:r>
@@ -2012,7 +2012,7 @@
         </w:pBdr>
         <w:shd w:val="clear" w:color="auto" w:fill="F7FBF8"/>
         <w:bidi/>
-        <w:spacing w:before="20" w:after="40" w:line="276" w:lineRule="auto"/>
+        <w:spacing w:before="0" w:after="20" w:line="252" w:lineRule="auto"/>
         <w:ind w:left="170" w:right="170"/>
       </w:pPr>
       <w:r>

</xml_diff>